<commit_message>
Módulo II: la intuición de cómo una máquina compara textos
- Sesión 4: dos láminas nuevas antes de la Práctica C, con los conteos
  reales de los 118 registros. TF-IDF como «frecuente aquí, raro en el
  resto» y los dos modos en que contar palabras falla. Práctica A baja a
  12 minutos para pagarlas y la agenda se recorre.
- Sesión 5: el anclaje a una carpeta se explica por cercanía de
  significado, que es la misma idea del viernes aplicada al RAG.
- Anexo visual «De las palabras a los números» para la charla del receso,
  con el puente a Gower y al Módulo III.
- Handouts 4 y 5 al día; el handout 4 renumera sus secciones.

Co-Authored-By: Claude Opus 5 <noreply@anthropic.com>
</commit_message>
<xml_diff>
--- a/sesion-04/Handout_Sesion_04.docx
+++ b/sesion-04/Handout_Sesion_04.docx
@@ -1250,54 +1250,7 @@
           <w:sz w:val="27"/>
           <w:szCs w:val="27"/>
         </w:rPr>
-        <w:t xml:space="preserve">3. Dos trampas que vas a encontrar</w:t>
-      </w:r>
-    </w:p>
-    <w:p>
-      <w:pPr>
-        <w:spacing w:after="90" w:line="280"/>
-        <w:ind w:left="520" w:hanging="260"/>
-        <w:jc w:val="both"/>
-      </w:pPr>
-      <w:r>
-        <w:rPr>
-          <w:rFonts w:ascii="Arial" w:cs="Arial" w:eastAsia="Arial" w:hAnsi="Arial"/>
-          <w:sz w:val="21"/>
-          <w:szCs w:val="21"/>
-        </w:rPr>
-        <w:t xml:space="preserve">•   Equivalencias forzadas. Cuando comparas varios documentos, cada uno le pone otro nombre a las cosas y el modelo va a forzar equivalencias que no existen. Población objetivo no es lo mismo que población potencial. Una lista limitativa no es lo mismo que una enunciativa.</w:t>
-      </w:r>
-    </w:p>
-    <w:p>
-      <w:pPr>
-        <w:spacing w:after="90" w:line="280"/>
-        <w:ind w:left="520" w:hanging="260"/>
-        <w:jc w:val="both"/>
-      </w:pPr>
-      <w:r>
-        <w:rPr>
-          <w:rFonts w:ascii="Arial" w:cs="Arial" w:eastAsia="Arial" w:hAnsi="Arial"/>
-          <w:sz w:val="21"/>
-          <w:szCs w:val="21"/>
-        </w:rPr>
-        <w:t xml:space="preserve">•   Registros que tocan dos temas. Una persona agradece el centro comunitario y en la misma frase se queja del retraso en los depósitos. Una clasificación de una sola etiqueta lo manda a un solo lado y pierde la mitad de lo que dice.</w:t>
-      </w:r>
-    </w:p>
-    <w:p>
-      <w:pPr>
-        <w:pStyle w:val="Heading1"/>
-        <w:spacing w:after="140" w:before="300"/>
-      </w:pPr>
-      <w:r>
-        <w:rPr>
-          <w:rFonts w:ascii="Arial" w:cs="Arial" w:eastAsia="Arial" w:hAnsi="Arial"/>
-          <w:b/>
-          <w:bCs/>
-          <w:color w:val="16262E"/>
-          <w:sz w:val="27"/>
-          <w:szCs w:val="27"/>
-        </w:rPr>
-        <w:t xml:space="preserve">4. Cuando el texto no cabe</w:t>
+        <w:t xml:space="preserve">3. Cómo decide la máquina que dos textos se parecen</w:t>
       </w:r>
     </w:p>
     <w:p>
@@ -1315,52 +1268,43 @@
           <w:sz w:val="21"/>
           <w:szCs w:val="21"/>
         </w:rPr>
-        <w:t xml:space="preserve">Toda herramienta tiene un límite de cuánto puede leer de una sola vez. El problema no es que falle: es que no te dice que no vio el resto, y el resumen suena igual de completo. Y aunque quepa, el peso se reparte: en un documento muy largo, un dato del medio recibe menos atención que uno del principio o del final.</w:t>
-      </w:r>
-    </w:p>
-    <w:p>
-      <w:pPr>
-        <w:spacing w:after="90" w:line="280"/>
-        <w:ind w:left="520" w:hanging="260"/>
+        <w:t xml:space="preserve">Antes de ratificar un libro de códigos conviene saber cómo agrupó el modelo. Una máquina no lee: convierte cada texto en números y mide distancias. El primer paso es contar palabras, y el segundo es pesarlas, porque no todas valen lo mismo.</w:t>
+      </w:r>
+    </w:p>
+    <w:p>
+      <w:pPr>
+        <w:spacing w:after="120" w:line="285"/>
         <w:jc w:val="both"/>
       </w:pPr>
       <w:r>
         <w:rPr>
           <w:rFonts w:ascii="Arial" w:cs="Arial" w:eastAsia="Arial" w:hAnsi="Arial"/>
+          <w:b w:val="false"/>
+          <w:bCs w:val="false"/>
+          <w:i w:val="false"/>
+          <w:iCs w:val="false"/>
           <w:sz w:val="21"/>
           <w:szCs w:val="21"/>
         </w:rPr>
-        <w:t xml:space="preserve">•   Parte el texto en bloques y consolida al final, con el mismo libro de códigos en todas las tandas.</w:t>
-      </w:r>
-    </w:p>
-    <w:p>
-      <w:pPr>
-        <w:spacing w:after="90" w:line="280"/>
-        <w:ind w:left="520" w:hanging="260"/>
+        <w:t xml:space="preserve">Ese peso se llama TF-IDF y cabe en una frase: una palabra pesa cuando es frecuente aquí y rara en el resto. En los 118 registros del curso, «tarjeta» aparece en 12 y «trámite» en 10, así que no distinguen casi nada; «convocatoria» y «rechazaron» aparecen en 3 y por eso sí marcan un tema. De ahí sale una consecuencia que te importa: una queja poco frecuente nunca junta peso suficiente para volverse categoría, y termina en la bolsa de «otros». No es descuido del modelo, es cómo está construida la medida.</w:t>
+      </w:r>
+    </w:p>
+    <w:p>
+      <w:pPr>
+        <w:spacing w:after="120" w:line="285"/>
         <w:jc w:val="both"/>
       </w:pPr>
       <w:r>
         <w:rPr>
           <w:rFonts w:ascii="Arial" w:cs="Arial" w:eastAsia="Arial" w:hAnsi="Arial"/>
+          <w:b w:val="false"/>
+          <w:bCs w:val="false"/>
+          <w:i w:val="false"/>
+          <w:iCs w:val="false"/>
           <w:sz w:val="21"/>
           <w:szCs w:val="21"/>
         </w:rPr>
-        <w:t xml:space="preserve">•   Trabaja con una muestra representativa y valida contra el total. Es lo que hiciste hoy, aunque no lo hayas notado.</w:t>
-      </w:r>
-    </w:p>
-    <w:p>
-      <w:pPr>
-        <w:spacing w:after="90" w:line="280"/>
-        <w:ind w:left="520" w:hanging="260"/>
-        <w:jc w:val="both"/>
-      </w:pPr>
-      <w:r>
-        <w:rPr>
-          <w:rFonts w:ascii="Arial" w:cs="Arial" w:eastAsia="Arial" w:hAnsi="Arial"/>
-          <w:sz w:val="21"/>
-          <w:szCs w:val="21"/>
-        </w:rPr>
-        <w:t xml:space="preserve">•   Pásate a código. Cuando son decenas de miles de registros, el chat ya no alcanza. Eso es el Módulo III.</w:t>
+        <w:t xml:space="preserve">Contar palabras falla en dos direcciones. Dos registros pueden compartir palabras y hablar de cosas distintas, como el que reporta que su esposo cobró con su tarjeta sin permiso y el que avisa que su tarjeta caducó y pregunta si pierde el apoyo mientras le dan la nueva: comparten tarjeta, quiere y saber, y no comparten tema. Y dos registros pueden no compartir ninguna palabra y decir lo mismo, como «el apoyo del bimestre no le ha llegado» y «no ha podido cobrar porque su cuenta aparece inactiva». Por eso las herramientas modernas convierten el texto en coordenadas, llamadas vectores, donde lo que significa parecido queda cerca aunque esté escrito con otras palabras. El anexo visual de esta sesión lo explica con las láminas del receso.</w:t>
       </w:r>
     </w:p>
     <w:p>
@@ -1377,7 +1321,134 @@
           <w:sz w:val="27"/>
           <w:szCs w:val="27"/>
         </w:rPr>
-        <w:t xml:space="preserve">5. Lo que entregas</w:t>
+        <w:t xml:space="preserve">4. Dos trampas que vas a encontrar</w:t>
+      </w:r>
+    </w:p>
+    <w:p>
+      <w:pPr>
+        <w:spacing w:after="90" w:line="280"/>
+        <w:ind w:left="520" w:hanging="260"/>
+        <w:jc w:val="both"/>
+      </w:pPr>
+      <w:r>
+        <w:rPr>
+          <w:rFonts w:ascii="Arial" w:cs="Arial" w:eastAsia="Arial" w:hAnsi="Arial"/>
+          <w:sz w:val="21"/>
+          <w:szCs w:val="21"/>
+        </w:rPr>
+        <w:t xml:space="preserve">•   Equivalencias forzadas. Cuando comparas varios documentos, cada uno le pone otro nombre a las cosas y el modelo va a forzar equivalencias que no existen. Población objetivo no es lo mismo que población potencial. Una lista limitativa no es lo mismo que una enunciativa.</w:t>
+      </w:r>
+    </w:p>
+    <w:p>
+      <w:pPr>
+        <w:spacing w:after="90" w:line="280"/>
+        <w:ind w:left="520" w:hanging="260"/>
+        <w:jc w:val="both"/>
+      </w:pPr>
+      <w:r>
+        <w:rPr>
+          <w:rFonts w:ascii="Arial" w:cs="Arial" w:eastAsia="Arial" w:hAnsi="Arial"/>
+          <w:sz w:val="21"/>
+          <w:szCs w:val="21"/>
+        </w:rPr>
+        <w:t xml:space="preserve">•   Registros que tocan dos temas. Una persona agradece el centro comunitario y en la misma frase se queja del retraso en los depósitos. Una clasificación de una sola etiqueta lo manda a un solo lado y pierde la mitad de lo que dice.</w:t>
+      </w:r>
+    </w:p>
+    <w:p>
+      <w:pPr>
+        <w:pStyle w:val="Heading1"/>
+        <w:spacing w:after="140" w:before="300"/>
+      </w:pPr>
+      <w:r>
+        <w:rPr>
+          <w:rFonts w:ascii="Arial" w:cs="Arial" w:eastAsia="Arial" w:hAnsi="Arial"/>
+          <w:b/>
+          <w:bCs/>
+          <w:color w:val="16262E"/>
+          <w:sz w:val="27"/>
+          <w:szCs w:val="27"/>
+        </w:rPr>
+        <w:t xml:space="preserve">5. Cuando el texto no cabe</w:t>
+      </w:r>
+    </w:p>
+    <w:p>
+      <w:pPr>
+        <w:spacing w:after="120" w:line="285"/>
+        <w:jc w:val="both"/>
+      </w:pPr>
+      <w:r>
+        <w:rPr>
+          <w:rFonts w:ascii="Arial" w:cs="Arial" w:eastAsia="Arial" w:hAnsi="Arial"/>
+          <w:b w:val="false"/>
+          <w:bCs w:val="false"/>
+          <w:i w:val="false"/>
+          <w:iCs w:val="false"/>
+          <w:sz w:val="21"/>
+          <w:szCs w:val="21"/>
+        </w:rPr>
+        <w:t xml:space="preserve">Toda herramienta tiene un límite de cuánto puede leer de una sola vez. El problema no es que falle: es que no te dice que no vio el resto, y el resumen suena igual de completo. Y aunque quepa, el peso se reparte: en un documento muy largo, un dato del medio recibe menos atención que uno del principio o del final.</w:t>
+      </w:r>
+    </w:p>
+    <w:p>
+      <w:pPr>
+        <w:spacing w:after="90" w:line="280"/>
+        <w:ind w:left="520" w:hanging="260"/>
+        <w:jc w:val="both"/>
+      </w:pPr>
+      <w:r>
+        <w:rPr>
+          <w:rFonts w:ascii="Arial" w:cs="Arial" w:eastAsia="Arial" w:hAnsi="Arial"/>
+          <w:sz w:val="21"/>
+          <w:szCs w:val="21"/>
+        </w:rPr>
+        <w:t xml:space="preserve">•   Parte el texto en bloques y consolida al final, con el mismo libro de códigos en todas las tandas.</w:t>
+      </w:r>
+    </w:p>
+    <w:p>
+      <w:pPr>
+        <w:spacing w:after="90" w:line="280"/>
+        <w:ind w:left="520" w:hanging="260"/>
+        <w:jc w:val="both"/>
+      </w:pPr>
+      <w:r>
+        <w:rPr>
+          <w:rFonts w:ascii="Arial" w:cs="Arial" w:eastAsia="Arial" w:hAnsi="Arial"/>
+          <w:sz w:val="21"/>
+          <w:szCs w:val="21"/>
+        </w:rPr>
+        <w:t xml:space="preserve">•   Trabaja con una muestra representativa y valida contra el total. Es lo que hiciste hoy, aunque no lo hayas notado.</w:t>
+      </w:r>
+    </w:p>
+    <w:p>
+      <w:pPr>
+        <w:spacing w:after="90" w:line="280"/>
+        <w:ind w:left="520" w:hanging="260"/>
+        <w:jc w:val="both"/>
+      </w:pPr>
+      <w:r>
+        <w:rPr>
+          <w:rFonts w:ascii="Arial" w:cs="Arial" w:eastAsia="Arial" w:hAnsi="Arial"/>
+          <w:sz w:val="21"/>
+          <w:szCs w:val="21"/>
+        </w:rPr>
+        <w:t xml:space="preserve">•   Pásate a código. Cuando son decenas de miles de registros, el chat ya no alcanza. Eso es el Módulo III.</w:t>
+      </w:r>
+    </w:p>
+    <w:p>
+      <w:pPr>
+        <w:pStyle w:val="Heading1"/>
+        <w:spacing w:after="140" w:before="300"/>
+      </w:pPr>
+      <w:r>
+        <w:rPr>
+          <w:rFonts w:ascii="Arial" w:cs="Arial" w:eastAsia="Arial" w:hAnsi="Arial"/>
+          <w:b/>
+          <w:bCs/>
+          <w:color w:val="16262E"/>
+          <w:sz w:val="27"/>
+          <w:szCs w:val="27"/>
+        </w:rPr>
+        <w:t xml:space="preserve">6. Lo que entregas</w:t>
       </w:r>
     </w:p>
     <w:tbl>

</xml_diff>